<commit_message>
fix(validation): restore Chinese template glyphs and await test cleanup
</commit_message>
<xml_diff>
--- a/packages/dsh-desktop-office/sources/curated/meeting-minutes/example.docx
+++ b/packages/dsh-desktop-office/sources/curated/meeting-minutes/example.docx
@@ -12,7 +12,7 @@
       </w:pPr>
       <w:r>
         <w:rPr>
-          <w:rFonts w:ascii="Arial" w:hAnsi="Arial" w:eastAsia="Hiragino Sans GB" w:cs="Arial"/>
+          <w:rFonts w:ascii="Arial" w:hAnsi="Arial" w:eastAsia="Hiragino Sans GB W3" w:cs="Arial"/>
           <w:b/>
           <w:color w:val="000000"/>
           <w:sz w:val="46"/>
@@ -28,7 +28,7 @@
       </w:pPr>
       <w:r>
         <w:rPr>
-          <w:rFonts w:ascii="Arial" w:hAnsi="Arial" w:eastAsia="Hiragino Sans GB" w:cs="Arial"/>
+          <w:rFonts w:ascii="Arial" w:hAnsi="Arial" w:eastAsia="Hiragino Sans GB W3" w:cs="Arial"/>
           <w:b w:val="0"/>
           <w:color w:val="555555"/>
           <w:sz w:val="21"/>
@@ -46,7 +46,7 @@
       </w:pPr>
       <w:r>
         <w:rPr>
-          <w:rFonts w:ascii="Arial" w:hAnsi="Arial" w:eastAsia="Hiragino Sans GB" w:cs="Arial"/>
+          <w:rFonts w:ascii="Arial" w:hAnsi="Arial" w:eastAsia="Hiragino Sans GB W3" w:cs="Arial"/>
           <w:b/>
           <w:color w:val="000000"/>
           <w:sz w:val="28"/>
@@ -62,7 +62,7 @@
       </w:pPr>
       <w:r>
         <w:rPr>
-          <w:rFonts w:ascii="Arial" w:hAnsi="Arial" w:eastAsia="Hiragino Sans GB" w:cs="Arial"/>
+          <w:rFonts w:ascii="Arial" w:hAnsi="Arial" w:eastAsia="Hiragino Sans GB W3" w:cs="Arial"/>
           <w:b w:val="0"/>
           <w:color w:val="000000"/>
           <w:sz w:val="22"/>
@@ -78,7 +78,7 @@
       </w:pPr>
       <w:r>
         <w:rPr>
-          <w:rFonts w:ascii="Arial" w:hAnsi="Arial" w:eastAsia="Hiragino Sans GB" w:cs="Arial"/>
+          <w:rFonts w:ascii="Arial" w:hAnsi="Arial" w:eastAsia="Hiragino Sans GB W3" w:cs="Arial"/>
           <w:b w:val="0"/>
           <w:color w:val="000000"/>
           <w:sz w:val="22"/>
@@ -96,7 +96,7 @@
       </w:pPr>
       <w:r>
         <w:rPr>
-          <w:rFonts w:ascii="Arial" w:hAnsi="Arial" w:eastAsia="Hiragino Sans GB" w:cs="Arial"/>
+          <w:rFonts w:ascii="Arial" w:hAnsi="Arial" w:eastAsia="Hiragino Sans GB W3" w:cs="Arial"/>
           <w:b/>
           <w:color w:val="000000"/>
           <w:sz w:val="28"/>
@@ -112,7 +112,7 @@
       </w:pPr>
       <w:r>
         <w:rPr>
-          <w:rFonts w:ascii="Arial" w:hAnsi="Arial" w:eastAsia="Hiragino Sans GB" w:cs="Arial"/>
+          <w:rFonts w:ascii="Arial" w:hAnsi="Arial" w:eastAsia="Hiragino Sans GB W3" w:cs="Arial"/>
           <w:b w:val="0"/>
           <w:color w:val="000000"/>
           <w:sz w:val="22"/>
@@ -128,7 +128,7 @@
       </w:pPr>
       <w:r>
         <w:rPr>
-          <w:rFonts w:ascii="Arial" w:hAnsi="Arial" w:eastAsia="Hiragino Sans GB" w:cs="Arial"/>
+          <w:rFonts w:ascii="Arial" w:hAnsi="Arial" w:eastAsia="Hiragino Sans GB W3" w:cs="Arial"/>
           <w:b w:val="0"/>
           <w:color w:val="000000"/>
           <w:sz w:val="22"/>
@@ -144,7 +144,7 @@
       </w:pPr>
       <w:r>
         <w:rPr>
-          <w:rFonts w:ascii="Arial" w:hAnsi="Arial" w:eastAsia="Hiragino Sans GB" w:cs="Arial"/>
+          <w:rFonts w:ascii="Arial" w:hAnsi="Arial" w:eastAsia="Hiragino Sans GB W3" w:cs="Arial"/>
           <w:b w:val="0"/>
           <w:color w:val="000000"/>
           <w:sz w:val="22"/>
@@ -160,7 +160,7 @@
       </w:pPr>
       <w:r>
         <w:rPr>
-          <w:rFonts w:ascii="Arial" w:hAnsi="Arial" w:eastAsia="Hiragino Sans GB" w:cs="Arial"/>
+          <w:rFonts w:ascii="Arial" w:hAnsi="Arial" w:eastAsia="Hiragino Sans GB W3" w:cs="Arial"/>
           <w:b w:val="0"/>
           <w:color w:val="000000"/>
           <w:sz w:val="22"/>
@@ -176,7 +176,7 @@
       </w:pPr>
       <w:r>
         <w:rPr>
-          <w:rFonts w:ascii="Arial" w:hAnsi="Arial" w:eastAsia="Hiragino Sans GB" w:cs="Arial"/>
+          <w:rFonts w:ascii="Arial" w:hAnsi="Arial" w:eastAsia="Hiragino Sans GB W3" w:cs="Arial"/>
           <w:b w:val="0"/>
           <w:color w:val="000000"/>
           <w:sz w:val="22"/>
@@ -194,7 +194,7 @@
       </w:pPr>
       <w:r>
         <w:rPr>
-          <w:rFonts w:ascii="Arial" w:hAnsi="Arial" w:eastAsia="Hiragino Sans GB" w:cs="Arial"/>
+          <w:rFonts w:ascii="Arial" w:hAnsi="Arial" w:eastAsia="Hiragino Sans GB W3" w:cs="Arial"/>
           <w:b/>
           <w:color w:val="000000"/>
           <w:sz w:val="28"/>
@@ -212,7 +212,7 @@
       </w:pPr>
       <w:r>
         <w:rPr>
-          <w:rFonts w:ascii="Arial" w:hAnsi="Arial" w:eastAsia="Hiragino Sans GB" w:cs="Arial"/>
+          <w:rFonts w:ascii="Arial" w:hAnsi="Arial" w:eastAsia="Hiragino Sans GB W3" w:cs="Arial"/>
           <w:b/>
           <w:color w:val="000000"/>
           <w:sz w:val="24"/>
@@ -228,7 +228,7 @@
       </w:pPr>
       <w:r>
         <w:rPr>
-          <w:rFonts w:ascii="Arial" w:hAnsi="Arial" w:eastAsia="Hiragino Sans GB" w:cs="Arial"/>
+          <w:rFonts w:ascii="Arial" w:hAnsi="Arial" w:eastAsia="Hiragino Sans GB W3" w:cs="Arial"/>
           <w:b w:val="0"/>
           <w:color w:val="000000"/>
           <w:sz w:val="22"/>
@@ -246,7 +246,7 @@
       </w:pPr>
       <w:r>
         <w:rPr>
-          <w:rFonts w:ascii="Arial" w:hAnsi="Arial" w:eastAsia="Hiragino Sans GB" w:cs="Arial"/>
+          <w:rFonts w:ascii="Arial" w:hAnsi="Arial" w:eastAsia="Hiragino Sans GB W3" w:cs="Arial"/>
           <w:b/>
           <w:color w:val="000000"/>
           <w:sz w:val="24"/>
@@ -262,7 +262,7 @@
       </w:pPr>
       <w:r>
         <w:rPr>
-          <w:rFonts w:ascii="Arial" w:hAnsi="Arial" w:eastAsia="Hiragino Sans GB" w:cs="Arial"/>
+          <w:rFonts w:ascii="Arial" w:hAnsi="Arial" w:eastAsia="Hiragino Sans GB W3" w:cs="Arial"/>
           <w:b w:val="0"/>
           <w:color w:val="000000"/>
           <w:sz w:val="22"/>
@@ -280,7 +280,7 @@
       </w:pPr>
       <w:r>
         <w:rPr>
-          <w:rFonts w:ascii="Arial" w:hAnsi="Arial" w:eastAsia="Hiragino Sans GB" w:cs="Arial"/>
+          <w:rFonts w:ascii="Arial" w:hAnsi="Arial" w:eastAsia="Hiragino Sans GB W3" w:cs="Arial"/>
           <w:b/>
           <w:color w:val="000000"/>
           <w:sz w:val="24"/>
@@ -296,7 +296,7 @@
       </w:pPr>
       <w:r>
         <w:rPr>
-          <w:rFonts w:ascii="Arial" w:hAnsi="Arial" w:eastAsia="Hiragino Sans GB" w:cs="Arial"/>
+          <w:rFonts w:ascii="Arial" w:hAnsi="Arial" w:eastAsia="Hiragino Sans GB W3" w:cs="Arial"/>
           <w:b w:val="0"/>
           <w:color w:val="000000"/>
           <w:sz w:val="22"/>
@@ -314,7 +314,7 @@
       </w:pPr>
       <w:r>
         <w:rPr>
-          <w:rFonts w:ascii="Arial" w:hAnsi="Arial" w:eastAsia="Hiragino Sans GB" w:cs="Arial"/>
+          <w:rFonts w:ascii="Arial" w:hAnsi="Arial" w:eastAsia="Hiragino Sans GB W3" w:cs="Arial"/>
           <w:b/>
           <w:color w:val="000000"/>
           <w:sz w:val="24"/>
@@ -330,7 +330,7 @@
       </w:pPr>
       <w:r>
         <w:rPr>
-          <w:rFonts w:ascii="Arial" w:hAnsi="Arial" w:eastAsia="Hiragino Sans GB" w:cs="Arial"/>
+          <w:rFonts w:ascii="Arial" w:hAnsi="Arial" w:eastAsia="Hiragino Sans GB W3" w:cs="Arial"/>
           <w:b w:val="0"/>
           <w:color w:val="000000"/>
           <w:sz w:val="22"/>
@@ -348,7 +348,7 @@
       </w:pPr>
       <w:r>
         <w:rPr>
-          <w:rFonts w:ascii="Arial" w:hAnsi="Arial" w:eastAsia="Hiragino Sans GB" w:cs="Arial"/>
+          <w:rFonts w:ascii="Arial" w:hAnsi="Arial" w:eastAsia="Hiragino Sans GB W3" w:cs="Arial"/>
           <w:b/>
           <w:color w:val="000000"/>
           <w:sz w:val="24"/>
@@ -364,7 +364,7 @@
       </w:pPr>
       <w:r>
         <w:rPr>
-          <w:rFonts w:ascii="Arial" w:hAnsi="Arial" w:eastAsia="Hiragino Sans GB" w:cs="Arial"/>
+          <w:rFonts w:ascii="Arial" w:hAnsi="Arial" w:eastAsia="Hiragino Sans GB W3" w:cs="Arial"/>
           <w:b w:val="0"/>
           <w:color w:val="000000"/>
           <w:sz w:val="22"/>
@@ -382,7 +382,7 @@
       </w:pPr>
       <w:r>
         <w:rPr>
-          <w:rFonts w:ascii="Arial" w:hAnsi="Arial" w:eastAsia="Hiragino Sans GB" w:cs="Arial"/>
+          <w:rFonts w:ascii="Arial" w:hAnsi="Arial" w:eastAsia="Hiragino Sans GB W3" w:cs="Arial"/>
           <w:b/>
           <w:color w:val="000000"/>
           <w:sz w:val="28"/>
@@ -436,7 +436,7 @@
             </w:pPr>
             <w:r>
               <w:rPr>
-                <w:rFonts w:ascii="Arial" w:hAnsi="Arial" w:eastAsia="Hiragino Sans GB" w:cs="Arial"/>
+                <w:rFonts w:ascii="Arial" w:hAnsi="Arial" w:eastAsia="Hiragino Sans GB W3" w:cs="Arial"/>
                 <w:b/>
                 <w:color w:val="000000"/>
                 <w:sz w:val="20"/>
@@ -459,7 +459,7 @@
             </w:pPr>
             <w:r>
               <w:rPr>
-                <w:rFonts w:ascii="Arial" w:hAnsi="Arial" w:eastAsia="Hiragino Sans GB" w:cs="Arial"/>
+                <w:rFonts w:ascii="Arial" w:hAnsi="Arial" w:eastAsia="Hiragino Sans GB W3" w:cs="Arial"/>
                 <w:b/>
                 <w:color w:val="000000"/>
                 <w:sz w:val="20"/>
@@ -482,7 +482,7 @@
             </w:pPr>
             <w:r>
               <w:rPr>
-                <w:rFonts w:ascii="Arial" w:hAnsi="Arial" w:eastAsia="Hiragino Sans GB" w:cs="Arial"/>
+                <w:rFonts w:ascii="Arial" w:hAnsi="Arial" w:eastAsia="Hiragino Sans GB W3" w:cs="Arial"/>
                 <w:b/>
                 <w:color w:val="000000"/>
                 <w:sz w:val="20"/>
@@ -509,7 +509,7 @@
             </w:pPr>
             <w:r>
               <w:rPr>
-                <w:rFonts w:ascii="Arial" w:hAnsi="Arial" w:eastAsia="Hiragino Sans GB" w:cs="Arial"/>
+                <w:rFonts w:ascii="Arial" w:hAnsi="Arial" w:eastAsia="Hiragino Sans GB W3" w:cs="Arial"/>
                 <w:b w:val="0"/>
                 <w:color w:val="000000"/>
                 <w:sz w:val="19"/>
@@ -525,7 +525,7 @@
             </w:pPr>
             <w:r>
               <w:rPr>
-                <w:rFonts w:ascii="Arial" w:hAnsi="Arial" w:eastAsia="Hiragino Sans GB" w:cs="Arial"/>
+                <w:rFonts w:ascii="Arial" w:hAnsi="Arial" w:eastAsia="Hiragino Sans GB W3" w:cs="Arial"/>
                 <w:b w:val="0"/>
                 <w:color w:val="555555"/>
                 <w:sz w:val="17"/>
@@ -541,7 +541,7 @@
             </w:pPr>
             <w:r>
               <w:rPr>
-                <w:rFonts w:ascii="Arial" w:hAnsi="Arial" w:eastAsia="Hiragino Sans GB" w:cs="Arial"/>
+                <w:rFonts w:ascii="Arial" w:hAnsi="Arial" w:eastAsia="Hiragino Sans GB W3" w:cs="Arial"/>
                 <w:b w:val="0"/>
                 <w:color w:val="555555"/>
                 <w:sz w:val="17"/>
@@ -563,7 +563,7 @@
             </w:pPr>
             <w:r>
               <w:rPr>
-                <w:rFonts w:ascii="Arial" w:hAnsi="Arial" w:eastAsia="Hiragino Sans GB" w:cs="Arial"/>
+                <w:rFonts w:ascii="Arial" w:hAnsi="Arial" w:eastAsia="Hiragino Sans GB W3" w:cs="Arial"/>
                 <w:b w:val="0"/>
                 <w:color w:val="000000"/>
                 <w:sz w:val="19"/>
@@ -585,7 +585,7 @@
             </w:pPr>
             <w:r>
               <w:rPr>
-                <w:rFonts w:ascii="Arial" w:hAnsi="Arial" w:eastAsia="Hiragino Sans GB" w:cs="Arial"/>
+                <w:rFonts w:ascii="Arial" w:hAnsi="Arial" w:eastAsia="Hiragino Sans GB W3" w:cs="Arial"/>
                 <w:b w:val="0"/>
                 <w:color w:val="000000"/>
                 <w:sz w:val="19"/>
@@ -613,7 +613,7 @@
             </w:pPr>
             <w:r>
               <w:rPr>
-                <w:rFonts w:ascii="Arial" w:hAnsi="Arial" w:eastAsia="Hiragino Sans GB" w:cs="Arial"/>
+                <w:rFonts w:ascii="Arial" w:hAnsi="Arial" w:eastAsia="Hiragino Sans GB W3" w:cs="Arial"/>
                 <w:b w:val="0"/>
                 <w:color w:val="000000"/>
                 <w:sz w:val="19"/>
@@ -629,7 +629,7 @@
             </w:pPr>
             <w:r>
               <w:rPr>
-                <w:rFonts w:ascii="Arial" w:hAnsi="Arial" w:eastAsia="Hiragino Sans GB" w:cs="Arial"/>
+                <w:rFonts w:ascii="Arial" w:hAnsi="Arial" w:eastAsia="Hiragino Sans GB W3" w:cs="Arial"/>
                 <w:b w:val="0"/>
                 <w:color w:val="555555"/>
                 <w:sz w:val="17"/>
@@ -645,7 +645,7 @@
             </w:pPr>
             <w:r>
               <w:rPr>
-                <w:rFonts w:ascii="Arial" w:hAnsi="Arial" w:eastAsia="Hiragino Sans GB" w:cs="Arial"/>
+                <w:rFonts w:ascii="Arial" w:hAnsi="Arial" w:eastAsia="Hiragino Sans GB W3" w:cs="Arial"/>
                 <w:b w:val="0"/>
                 <w:color w:val="555555"/>
                 <w:sz w:val="17"/>
@@ -668,7 +668,7 @@
             </w:pPr>
             <w:r>
               <w:rPr>
-                <w:rFonts w:ascii="Arial" w:hAnsi="Arial" w:eastAsia="Hiragino Sans GB" w:cs="Arial"/>
+                <w:rFonts w:ascii="Arial" w:hAnsi="Arial" w:eastAsia="Hiragino Sans GB W3" w:cs="Arial"/>
                 <w:b w:val="0"/>
                 <w:color w:val="000000"/>
                 <w:sz w:val="19"/>
@@ -691,7 +691,7 @@
             </w:pPr>
             <w:r>
               <w:rPr>
-                <w:rFonts w:ascii="Arial" w:hAnsi="Arial" w:eastAsia="Hiragino Sans GB" w:cs="Arial"/>
+                <w:rFonts w:ascii="Arial" w:hAnsi="Arial" w:eastAsia="Hiragino Sans GB W3" w:cs="Arial"/>
                 <w:b w:val="0"/>
                 <w:color w:val="000000"/>
                 <w:sz w:val="19"/>
@@ -718,7 +718,7 @@
             </w:pPr>
             <w:r>
               <w:rPr>
-                <w:rFonts w:ascii="Arial" w:hAnsi="Arial" w:eastAsia="Hiragino Sans GB" w:cs="Arial"/>
+                <w:rFonts w:ascii="Arial" w:hAnsi="Arial" w:eastAsia="Hiragino Sans GB W3" w:cs="Arial"/>
                 <w:b w:val="0"/>
                 <w:color w:val="000000"/>
                 <w:sz w:val="19"/>
@@ -734,7 +734,7 @@
             </w:pPr>
             <w:r>
               <w:rPr>
-                <w:rFonts w:ascii="Arial" w:hAnsi="Arial" w:eastAsia="Hiragino Sans GB" w:cs="Arial"/>
+                <w:rFonts w:ascii="Arial" w:hAnsi="Arial" w:eastAsia="Hiragino Sans GB W3" w:cs="Arial"/>
                 <w:b w:val="0"/>
                 <w:color w:val="555555"/>
                 <w:sz w:val="17"/>
@@ -750,7 +750,7 @@
             </w:pPr>
             <w:r>
               <w:rPr>
-                <w:rFonts w:ascii="Arial" w:hAnsi="Arial" w:eastAsia="Hiragino Sans GB" w:cs="Arial"/>
+                <w:rFonts w:ascii="Arial" w:hAnsi="Arial" w:eastAsia="Hiragino Sans GB W3" w:cs="Arial"/>
                 <w:b w:val="0"/>
                 <w:color w:val="555555"/>
                 <w:sz w:val="17"/>
@@ -772,7 +772,7 @@
             </w:pPr>
             <w:r>
               <w:rPr>
-                <w:rFonts w:ascii="Arial" w:hAnsi="Arial" w:eastAsia="Hiragino Sans GB" w:cs="Arial"/>
+                <w:rFonts w:ascii="Arial" w:hAnsi="Arial" w:eastAsia="Hiragino Sans GB W3" w:cs="Arial"/>
                 <w:b w:val="0"/>
                 <w:color w:val="000000"/>
                 <w:sz w:val="19"/>
@@ -794,7 +794,7 @@
             </w:pPr>
             <w:r>
               <w:rPr>
-                <w:rFonts w:ascii="Arial" w:hAnsi="Arial" w:eastAsia="Hiragino Sans GB" w:cs="Arial"/>
+                <w:rFonts w:ascii="Arial" w:hAnsi="Arial" w:eastAsia="Hiragino Sans GB W3" w:cs="Arial"/>
                 <w:b w:val="0"/>
                 <w:color w:val="000000"/>
                 <w:sz w:val="19"/>
@@ -822,7 +822,7 @@
             </w:pPr>
             <w:r>
               <w:rPr>
-                <w:rFonts w:ascii="Arial" w:hAnsi="Arial" w:eastAsia="Hiragino Sans GB" w:cs="Arial"/>
+                <w:rFonts w:ascii="Arial" w:hAnsi="Arial" w:eastAsia="Hiragino Sans GB W3" w:cs="Arial"/>
                 <w:b w:val="0"/>
                 <w:color w:val="000000"/>
                 <w:sz w:val="19"/>
@@ -838,7 +838,7 @@
             </w:pPr>
             <w:r>
               <w:rPr>
-                <w:rFonts w:ascii="Arial" w:hAnsi="Arial" w:eastAsia="Hiragino Sans GB" w:cs="Arial"/>
+                <w:rFonts w:ascii="Arial" w:hAnsi="Arial" w:eastAsia="Hiragino Sans GB W3" w:cs="Arial"/>
                 <w:b w:val="0"/>
                 <w:color w:val="555555"/>
                 <w:sz w:val="17"/>
@@ -854,7 +854,7 @@
             </w:pPr>
             <w:r>
               <w:rPr>
-                <w:rFonts w:ascii="Arial" w:hAnsi="Arial" w:eastAsia="Hiragino Sans GB" w:cs="Arial"/>
+                <w:rFonts w:ascii="Arial" w:hAnsi="Arial" w:eastAsia="Hiragino Sans GB W3" w:cs="Arial"/>
                 <w:b w:val="0"/>
                 <w:color w:val="555555"/>
                 <w:sz w:val="17"/>
@@ -877,7 +877,7 @@
             </w:pPr>
             <w:r>
               <w:rPr>
-                <w:rFonts w:ascii="Arial" w:hAnsi="Arial" w:eastAsia="Hiragino Sans GB" w:cs="Arial"/>
+                <w:rFonts w:ascii="Arial" w:hAnsi="Arial" w:eastAsia="Hiragino Sans GB W3" w:cs="Arial"/>
                 <w:b w:val="0"/>
                 <w:color w:val="000000"/>
                 <w:sz w:val="19"/>
@@ -900,7 +900,7 @@
             </w:pPr>
             <w:r>
               <w:rPr>
-                <w:rFonts w:ascii="Arial" w:hAnsi="Arial" w:eastAsia="Hiragino Sans GB" w:cs="Arial"/>
+                <w:rFonts w:ascii="Arial" w:hAnsi="Arial" w:eastAsia="Hiragino Sans GB W3" w:cs="Arial"/>
                 <w:b w:val="0"/>
                 <w:color w:val="000000"/>
                 <w:sz w:val="19"/>
@@ -927,7 +927,7 @@
             </w:pPr>
             <w:r>
               <w:rPr>
-                <w:rFonts w:ascii="Arial" w:hAnsi="Arial" w:eastAsia="Hiragino Sans GB" w:cs="Arial"/>
+                <w:rFonts w:ascii="Arial" w:hAnsi="Arial" w:eastAsia="Hiragino Sans GB W3" w:cs="Arial"/>
                 <w:b w:val="0"/>
                 <w:color w:val="000000"/>
                 <w:sz w:val="19"/>
@@ -945,7 +945,7 @@
               <w:rPr>
                 <w:color w:val="555555"/>
                 <w:sz w:val="17"/>
-                <w:rFonts w:ascii="Arial" w:hAnsi="Arial" w:eastAsia="Hiragino Sans GB"/>
+                <w:rFonts w:ascii="Arial" w:hAnsi="Arial" w:eastAsia="Hiragino Sans GB W3"/>
               </w:rPr>
               <w:t>交付：运营先对齐框架，再写逐字稿，市场润色话术</w:t>
             </w:r>
@@ -958,7 +958,7 @@
             </w:pPr>
             <w:r>
               <w:rPr>
-                <w:rFonts w:ascii="Arial" w:hAnsi="Arial" w:eastAsia="Hiragino Sans GB" w:cs="Arial"/>
+                <w:rFonts w:ascii="Arial" w:hAnsi="Arial" w:eastAsia="Hiragino Sans GB W3" w:cs="Arial"/>
                 <w:b w:val="0"/>
                 <w:color w:val="555555"/>
                 <w:sz w:val="17"/>
@@ -980,7 +980,7 @@
             </w:pPr>
             <w:r>
               <w:rPr>
-                <w:rFonts w:ascii="Arial" w:hAnsi="Arial" w:eastAsia="Hiragino Sans GB" w:cs="Arial"/>
+                <w:rFonts w:ascii="Arial" w:hAnsi="Arial" w:eastAsia="Hiragino Sans GB W3" w:cs="Arial"/>
                 <w:b w:val="0"/>
                 <w:color w:val="000000"/>
                 <w:sz w:val="19"/>
@@ -1002,7 +1002,7 @@
             </w:pPr>
             <w:r>
               <w:rPr>
-                <w:rFonts w:ascii="Arial" w:hAnsi="Arial" w:eastAsia="Hiragino Sans GB" w:cs="Arial"/>
+                <w:rFonts w:ascii="Arial" w:hAnsi="Arial" w:eastAsia="Hiragino Sans GB W3" w:cs="Arial"/>
                 <w:b w:val="0"/>
                 <w:color w:val="000000"/>
                 <w:sz w:val="19"/>
@@ -1030,7 +1030,7 @@
             </w:pPr>
             <w:r>
               <w:rPr>
-                <w:rFonts w:ascii="Arial" w:hAnsi="Arial" w:eastAsia="Hiragino Sans GB" w:cs="Arial"/>
+                <w:rFonts w:ascii="Arial" w:hAnsi="Arial" w:eastAsia="Hiragino Sans GB W3" w:cs="Arial"/>
                 <w:b w:val="0"/>
                 <w:color w:val="000000"/>
                 <w:sz w:val="19"/>
@@ -1046,7 +1046,7 @@
             </w:pPr>
             <w:r>
               <w:rPr>
-                <w:rFonts w:ascii="Arial" w:hAnsi="Arial" w:eastAsia="Hiragino Sans GB" w:cs="Arial"/>
+                <w:rFonts w:ascii="Arial" w:hAnsi="Arial" w:eastAsia="Hiragino Sans GB W3" w:cs="Arial"/>
                 <w:b w:val="0"/>
                 <w:color w:val="555555"/>
                 <w:sz w:val="17"/>
@@ -1062,7 +1062,7 @@
             </w:pPr>
             <w:r>
               <w:rPr>
-                <w:rFonts w:ascii="Arial" w:hAnsi="Arial" w:eastAsia="Hiragino Sans GB" w:cs="Arial"/>
+                <w:rFonts w:ascii="Arial" w:hAnsi="Arial" w:eastAsia="Hiragino Sans GB W3" w:cs="Arial"/>
                 <w:b w:val="0"/>
                 <w:color w:val="555555"/>
                 <w:sz w:val="17"/>
@@ -1085,7 +1085,7 @@
             </w:pPr>
             <w:r>
               <w:rPr>
-                <w:rFonts w:ascii="Arial" w:hAnsi="Arial" w:eastAsia="Hiragino Sans GB" w:cs="Arial"/>
+                <w:rFonts w:ascii="Arial" w:hAnsi="Arial" w:eastAsia="Hiragino Sans GB W3" w:cs="Arial"/>
                 <w:b w:val="0"/>
                 <w:color w:val="000000"/>
                 <w:sz w:val="19"/>
@@ -1110,7 +1110,7 @@
               <w:rPr>
                 <w:color w:val="000000"/>
                 <w:sz w:val="19"/>
-                <w:rFonts w:ascii="Arial" w:hAnsi="Arial" w:eastAsia="Hiragino Sans GB"/>
+                <w:rFonts w:ascii="Arial" w:hAnsi="Arial" w:eastAsia="Hiragino Sans GB W3"/>
               </w:rPr>
               <w:t>明天下午对齐</w:t>
             </w:r>
@@ -1134,7 +1134,7 @@
             </w:pPr>
             <w:r>
               <w:rPr>
-                <w:rFonts w:ascii="Arial" w:hAnsi="Arial" w:eastAsia="Hiragino Sans GB" w:cs="Arial"/>
+                <w:rFonts w:ascii="Arial" w:hAnsi="Arial" w:eastAsia="Hiragino Sans GB W3" w:cs="Arial"/>
                 <w:b w:val="0"/>
                 <w:color w:val="000000"/>
                 <w:sz w:val="19"/>
@@ -1150,7 +1150,7 @@
             </w:pPr>
             <w:r>
               <w:rPr>
-                <w:rFonts w:ascii="Arial" w:hAnsi="Arial" w:eastAsia="Hiragino Sans GB" w:cs="Arial"/>
+                <w:rFonts w:ascii="Arial" w:hAnsi="Arial" w:eastAsia="Hiragino Sans GB W3" w:cs="Arial"/>
                 <w:b w:val="0"/>
                 <w:color w:val="555555"/>
                 <w:sz w:val="17"/>
@@ -1166,7 +1166,7 @@
             </w:pPr>
             <w:r>
               <w:rPr>
-                <w:rFonts w:ascii="Arial" w:hAnsi="Arial" w:eastAsia="Hiragino Sans GB" w:cs="Arial"/>
+                <w:rFonts w:ascii="Arial" w:hAnsi="Arial" w:eastAsia="Hiragino Sans GB W3" w:cs="Arial"/>
                 <w:b w:val="0"/>
                 <w:color w:val="555555"/>
                 <w:sz w:val="17"/>
@@ -1188,7 +1188,7 @@
             </w:pPr>
             <w:r>
               <w:rPr>
-                <w:rFonts w:ascii="Arial" w:hAnsi="Arial" w:eastAsia="Hiragino Sans GB" w:cs="Arial"/>
+                <w:rFonts w:ascii="Arial" w:hAnsi="Arial" w:eastAsia="Hiragino Sans GB W3" w:cs="Arial"/>
                 <w:b w:val="0"/>
                 <w:color w:val="000000"/>
                 <w:sz w:val="19"/>
@@ -1210,7 +1210,7 @@
             </w:pPr>
             <w:r>
               <w:rPr>
-                <w:rFonts w:ascii="Arial" w:hAnsi="Arial" w:eastAsia="Hiragino Sans GB" w:cs="Arial"/>
+                <w:rFonts w:ascii="Arial" w:hAnsi="Arial" w:eastAsia="Hiragino Sans GB W3" w:cs="Arial"/>
                 <w:b w:val="0"/>
                 <w:color w:val="000000"/>
                 <w:sz w:val="19"/>
@@ -1238,7 +1238,7 @@
             </w:pPr>
             <w:r>
               <w:rPr>
-                <w:rFonts w:ascii="Arial" w:hAnsi="Arial" w:eastAsia="Hiragino Sans GB" w:cs="Arial"/>
+                <w:rFonts w:ascii="Arial" w:hAnsi="Arial" w:eastAsia="Hiragino Sans GB W3" w:cs="Arial"/>
                 <w:b w:val="0"/>
                 <w:color w:val="000000"/>
                 <w:sz w:val="19"/>
@@ -1254,7 +1254,7 @@
             </w:pPr>
             <w:r>
               <w:rPr>
-                <w:rFonts w:ascii="Arial" w:hAnsi="Arial" w:eastAsia="Hiragino Sans GB" w:cs="Arial"/>
+                <w:rFonts w:ascii="Arial" w:hAnsi="Arial" w:eastAsia="Hiragino Sans GB W3" w:cs="Arial"/>
                 <w:b w:val="0"/>
                 <w:color w:val="555555"/>
                 <w:sz w:val="17"/>
@@ -1270,7 +1270,7 @@
             </w:pPr>
             <w:r>
               <w:rPr>
-                <w:rFonts w:ascii="Arial" w:hAnsi="Arial" w:eastAsia="Hiragino Sans GB" w:cs="Arial"/>
+                <w:rFonts w:ascii="Arial" w:hAnsi="Arial" w:eastAsia="Hiragino Sans GB W3" w:cs="Arial"/>
                 <w:b w:val="0"/>
                 <w:color w:val="555555"/>
                 <w:sz w:val="17"/>
@@ -1293,7 +1293,7 @@
             </w:pPr>
             <w:r>
               <w:rPr>
-                <w:rFonts w:ascii="Arial" w:hAnsi="Arial" w:eastAsia="Hiragino Sans GB" w:cs="Arial"/>
+                <w:rFonts w:ascii="Arial" w:hAnsi="Arial" w:eastAsia="Hiragino Sans GB W3" w:cs="Arial"/>
                 <w:b w:val="0"/>
                 <w:color w:val="000000"/>
                 <w:sz w:val="19"/>
@@ -1316,7 +1316,7 @@
             </w:pPr>
             <w:r>
               <w:rPr>
-                <w:rFonts w:ascii="Arial" w:hAnsi="Arial" w:eastAsia="Hiragino Sans GB" w:cs="Arial"/>
+                <w:rFonts w:ascii="Arial" w:hAnsi="Arial" w:eastAsia="Hiragino Sans GB W3" w:cs="Arial"/>
                 <w:b w:val="0"/>
                 <w:color w:val="000000"/>
                 <w:sz w:val="19"/>
@@ -1343,7 +1343,7 @@
             </w:pPr>
             <w:r>
               <w:rPr>
-                <w:rFonts w:ascii="Arial" w:hAnsi="Arial" w:eastAsia="Hiragino Sans GB" w:cs="Arial"/>
+                <w:rFonts w:ascii="Arial" w:hAnsi="Arial" w:eastAsia="Hiragino Sans GB W3" w:cs="Arial"/>
                 <w:b w:val="0"/>
                 <w:color w:val="000000"/>
                 <w:sz w:val="19"/>
@@ -1359,7 +1359,7 @@
             </w:pPr>
             <w:r>
               <w:rPr>
-                <w:rFonts w:ascii="Arial" w:hAnsi="Arial" w:eastAsia="Hiragino Sans GB" w:cs="Arial"/>
+                <w:rFonts w:ascii="Arial" w:hAnsi="Arial" w:eastAsia="Hiragino Sans GB W3" w:cs="Arial"/>
                 <w:b w:val="0"/>
                 <w:color w:val="555555"/>
                 <w:sz w:val="17"/>
@@ -1375,7 +1375,7 @@
             </w:pPr>
             <w:r>
               <w:rPr>
-                <w:rFonts w:ascii="Arial" w:hAnsi="Arial" w:eastAsia="Hiragino Sans GB" w:cs="Arial"/>
+                <w:rFonts w:ascii="Arial" w:hAnsi="Arial" w:eastAsia="Hiragino Sans GB W3" w:cs="Arial"/>
                 <w:b w:val="0"/>
                 <w:color w:val="555555"/>
                 <w:sz w:val="17"/>
@@ -1397,7 +1397,7 @@
             </w:pPr>
             <w:r>
               <w:rPr>
-                <w:rFonts w:ascii="Arial" w:hAnsi="Arial" w:eastAsia="Hiragino Sans GB" w:cs="Arial"/>
+                <w:rFonts w:ascii="Arial" w:hAnsi="Arial" w:eastAsia="Hiragino Sans GB W3" w:cs="Arial"/>
                 <w:b w:val="0"/>
                 <w:color w:val="000000"/>
                 <w:sz w:val="19"/>
@@ -1419,7 +1419,7 @@
             </w:pPr>
             <w:r>
               <w:rPr>
-                <w:rFonts w:ascii="Arial" w:hAnsi="Arial" w:eastAsia="Hiragino Sans GB" w:cs="Arial"/>
+                <w:rFonts w:ascii="Arial" w:hAnsi="Arial" w:eastAsia="Hiragino Sans GB W3" w:cs="Arial"/>
                 <w:b w:val="0"/>
                 <w:color w:val="000000"/>
                 <w:sz w:val="19"/>
@@ -1447,7 +1447,7 @@
             </w:pPr>
             <w:r>
               <w:rPr>
-                <w:rFonts w:ascii="Arial" w:hAnsi="Arial" w:eastAsia="Hiragino Sans GB" w:cs="Arial"/>
+                <w:rFonts w:ascii="Arial" w:hAnsi="Arial" w:eastAsia="Hiragino Sans GB W3" w:cs="Arial"/>
                 <w:b w:val="0"/>
                 <w:color w:val="000000"/>
                 <w:sz w:val="19"/>
@@ -1463,7 +1463,7 @@
             </w:pPr>
             <w:r>
               <w:rPr>
-                <w:rFonts w:ascii="Arial" w:hAnsi="Arial" w:eastAsia="Hiragino Sans GB" w:cs="Arial"/>
+                <w:rFonts w:ascii="Arial" w:hAnsi="Arial" w:eastAsia="Hiragino Sans GB W3" w:cs="Arial"/>
                 <w:b w:val="0"/>
                 <w:color w:val="555555"/>
                 <w:sz w:val="17"/>
@@ -1479,7 +1479,7 @@
             </w:pPr>
             <w:r>
               <w:rPr>
-                <w:rFonts w:ascii="Arial" w:hAnsi="Arial" w:eastAsia="Hiragino Sans GB" w:cs="Arial"/>
+                <w:rFonts w:ascii="Arial" w:hAnsi="Arial" w:eastAsia="Hiragino Sans GB W3" w:cs="Arial"/>
                 <w:b w:val="0"/>
                 <w:color w:val="555555"/>
                 <w:sz w:val="17"/>
@@ -1502,7 +1502,7 @@
             </w:pPr>
             <w:r>
               <w:rPr>
-                <w:rFonts w:ascii="Arial" w:hAnsi="Arial" w:eastAsia="Hiragino Sans GB" w:cs="Arial"/>
+                <w:rFonts w:ascii="Arial" w:hAnsi="Arial" w:eastAsia="Hiragino Sans GB W3" w:cs="Arial"/>
                 <w:b w:val="0"/>
                 <w:color w:val="000000"/>
                 <w:sz w:val="19"/>
@@ -1525,7 +1525,7 @@
             </w:pPr>
             <w:r>
               <w:rPr>
-                <w:rFonts w:ascii="Arial" w:hAnsi="Arial" w:eastAsia="Hiragino Sans GB" w:cs="Arial"/>
+                <w:rFonts w:ascii="Arial" w:hAnsi="Arial" w:eastAsia="Hiragino Sans GB W3" w:cs="Arial"/>
                 <w:b w:val="0"/>
                 <w:color w:val="000000"/>
                 <w:sz w:val="19"/>
@@ -1552,7 +1552,7 @@
             </w:pPr>
             <w:r>
               <w:rPr>
-                <w:rFonts w:ascii="Arial" w:hAnsi="Arial" w:eastAsia="Hiragino Sans GB" w:cs="Arial"/>
+                <w:rFonts w:ascii="Arial" w:hAnsi="Arial" w:eastAsia="Hiragino Sans GB W3" w:cs="Arial"/>
                 <w:b w:val="0"/>
                 <w:color w:val="000000"/>
                 <w:sz w:val="19"/>
@@ -1568,7 +1568,7 @@
             </w:pPr>
             <w:r>
               <w:rPr>
-                <w:rFonts w:ascii="Arial" w:hAnsi="Arial" w:eastAsia="Hiragino Sans GB" w:cs="Arial"/>
+                <w:rFonts w:ascii="Arial" w:hAnsi="Arial" w:eastAsia="Hiragino Sans GB W3" w:cs="Arial"/>
                 <w:b w:val="0"/>
                 <w:color w:val="555555"/>
                 <w:sz w:val="17"/>
@@ -1584,7 +1584,7 @@
             </w:pPr>
             <w:r>
               <w:rPr>
-                <w:rFonts w:ascii="Arial" w:hAnsi="Arial" w:eastAsia="Hiragino Sans GB" w:cs="Arial"/>
+                <w:rFonts w:ascii="Arial" w:hAnsi="Arial" w:eastAsia="Hiragino Sans GB W3" w:cs="Arial"/>
                 <w:b w:val="0"/>
                 <w:color w:val="555555"/>
                 <w:sz w:val="17"/>
@@ -1606,7 +1606,7 @@
             </w:pPr>
             <w:r>
               <w:rPr>
-                <w:rFonts w:ascii="Arial" w:hAnsi="Arial" w:eastAsia="Hiragino Sans GB" w:cs="Arial"/>
+                <w:rFonts w:ascii="Arial" w:hAnsi="Arial" w:eastAsia="Hiragino Sans GB W3" w:cs="Arial"/>
                 <w:b w:val="0"/>
                 <w:color w:val="000000"/>
                 <w:sz w:val="19"/>
@@ -1628,7 +1628,7 @@
             </w:pPr>
             <w:r>
               <w:rPr>
-                <w:rFonts w:ascii="Arial" w:hAnsi="Arial" w:eastAsia="Hiragino Sans GB" w:cs="Arial"/>
+                <w:rFonts w:ascii="Arial" w:hAnsi="Arial" w:eastAsia="Hiragino Sans GB W3" w:cs="Arial"/>
                 <w:b w:val="0"/>
                 <w:color w:val="000000"/>
                 <w:sz w:val="19"/>
@@ -1656,7 +1656,7 @@
             </w:pPr>
             <w:r>
               <w:rPr>
-                <w:rFonts w:ascii="Arial" w:hAnsi="Arial" w:eastAsia="Hiragino Sans GB" w:cs="Arial"/>
+                <w:rFonts w:ascii="Arial" w:hAnsi="Arial" w:eastAsia="Hiragino Sans GB W3" w:cs="Arial"/>
                 <w:b w:val="0"/>
                 <w:color w:val="000000"/>
                 <w:sz w:val="19"/>
@@ -1672,7 +1672,7 @@
             </w:pPr>
             <w:r>
               <w:rPr>
-                <w:rFonts w:ascii="Arial" w:hAnsi="Arial" w:eastAsia="Hiragino Sans GB" w:cs="Arial"/>
+                <w:rFonts w:ascii="Arial" w:hAnsi="Arial" w:eastAsia="Hiragino Sans GB W3" w:cs="Arial"/>
                 <w:b w:val="0"/>
                 <w:color w:val="555555"/>
                 <w:sz w:val="17"/>
@@ -1688,7 +1688,7 @@
             </w:pPr>
             <w:r>
               <w:rPr>
-                <w:rFonts w:ascii="Arial" w:hAnsi="Arial" w:eastAsia="Hiragino Sans GB" w:cs="Arial"/>
+                <w:rFonts w:ascii="Arial" w:hAnsi="Arial" w:eastAsia="Hiragino Sans GB W3" w:cs="Arial"/>
                 <w:b w:val="0"/>
                 <w:color w:val="555555"/>
                 <w:sz w:val="17"/>
@@ -1711,7 +1711,7 @@
             </w:pPr>
             <w:r>
               <w:rPr>
-                <w:rFonts w:ascii="Arial" w:hAnsi="Arial" w:eastAsia="Hiragino Sans GB" w:cs="Arial"/>
+                <w:rFonts w:ascii="Arial" w:hAnsi="Arial" w:eastAsia="Hiragino Sans GB W3" w:cs="Arial"/>
                 <w:b w:val="0"/>
                 <w:color w:val="000000"/>
                 <w:sz w:val="19"/>
@@ -1734,7 +1734,7 @@
             </w:pPr>
             <w:r>
               <w:rPr>
-                <w:rFonts w:ascii="Arial" w:hAnsi="Arial" w:eastAsia="Hiragino Sans GB" w:cs="Arial"/>
+                <w:rFonts w:ascii="Arial" w:hAnsi="Arial" w:eastAsia="Hiragino Sans GB W3" w:cs="Arial"/>
                 <w:b w:val="0"/>
                 <w:color w:val="000000"/>
                 <w:sz w:val="19"/>
@@ -1761,7 +1761,7 @@
             </w:pPr>
             <w:r>
               <w:rPr>
-                <w:rFonts w:ascii="Arial" w:hAnsi="Arial" w:eastAsia="Hiragino Sans GB" w:cs="Arial"/>
+                <w:rFonts w:ascii="Arial" w:hAnsi="Arial" w:eastAsia="Hiragino Sans GB W3" w:cs="Arial"/>
                 <w:b w:val="0"/>
                 <w:color w:val="000000"/>
                 <w:sz w:val="19"/>
@@ -1777,7 +1777,7 @@
             </w:pPr>
             <w:r>
               <w:rPr>
-                <w:rFonts w:ascii="Arial" w:hAnsi="Arial" w:eastAsia="Hiragino Sans GB" w:cs="Arial"/>
+                <w:rFonts w:ascii="Arial" w:hAnsi="Arial" w:eastAsia="Hiragino Sans GB W3" w:cs="Arial"/>
                 <w:b w:val="0"/>
                 <w:color w:val="555555"/>
                 <w:sz w:val="17"/>
@@ -1793,7 +1793,7 @@
             </w:pPr>
             <w:r>
               <w:rPr>
-                <w:rFonts w:ascii="Arial" w:hAnsi="Arial" w:eastAsia="Hiragino Sans GB" w:cs="Arial"/>
+                <w:rFonts w:ascii="Arial" w:hAnsi="Arial" w:eastAsia="Hiragino Sans GB W3" w:cs="Arial"/>
                 <w:b w:val="0"/>
                 <w:color w:val="555555"/>
                 <w:sz w:val="17"/>
@@ -1815,7 +1815,7 @@
             </w:pPr>
             <w:r>
               <w:rPr>
-                <w:rFonts w:ascii="Arial" w:hAnsi="Arial" w:eastAsia="Hiragino Sans GB" w:cs="Arial"/>
+                <w:rFonts w:ascii="Arial" w:hAnsi="Arial" w:eastAsia="Hiragino Sans GB W3" w:cs="Arial"/>
                 <w:b w:val="0"/>
                 <w:color w:val="000000"/>
                 <w:sz w:val="19"/>
@@ -1837,7 +1837,7 @@
             </w:pPr>
             <w:r>
               <w:rPr>
-                <w:rFonts w:ascii="Arial" w:hAnsi="Arial" w:eastAsia="Hiragino Sans GB" w:cs="Arial"/>
+                <w:rFonts w:ascii="Arial" w:hAnsi="Arial" w:eastAsia="Hiragino Sans GB W3" w:cs="Arial"/>
                 <w:b w:val="0"/>
                 <w:color w:val="000000"/>
                 <w:sz w:val="19"/>
@@ -1865,7 +1865,7 @@
             </w:pPr>
             <w:r>
               <w:rPr>
-                <w:rFonts w:ascii="Arial" w:hAnsi="Arial" w:eastAsia="Hiragino Sans GB" w:cs="Arial"/>
+                <w:rFonts w:ascii="Arial" w:hAnsi="Arial" w:eastAsia="Hiragino Sans GB W3" w:cs="Arial"/>
                 <w:b w:val="0"/>
                 <w:color w:val="000000"/>
                 <w:sz w:val="19"/>
@@ -1881,7 +1881,7 @@
             </w:pPr>
             <w:r>
               <w:rPr>
-                <w:rFonts w:ascii="Arial" w:hAnsi="Arial" w:eastAsia="Hiragino Sans GB" w:cs="Arial"/>
+                <w:rFonts w:ascii="Arial" w:hAnsi="Arial" w:eastAsia="Hiragino Sans GB W3" w:cs="Arial"/>
                 <w:b w:val="0"/>
                 <w:color w:val="555555"/>
                 <w:sz w:val="17"/>
@@ -1897,7 +1897,7 @@
             </w:pPr>
             <w:r>
               <w:rPr>
-                <w:rFonts w:ascii="Arial" w:hAnsi="Arial" w:eastAsia="Hiragino Sans GB" w:cs="Arial"/>
+                <w:rFonts w:ascii="Arial" w:hAnsi="Arial" w:eastAsia="Hiragino Sans GB W3" w:cs="Arial"/>
                 <w:b w:val="0"/>
                 <w:color w:val="555555"/>
                 <w:sz w:val="17"/>
@@ -1920,7 +1920,7 @@
             </w:pPr>
             <w:r>
               <w:rPr>
-                <w:rFonts w:ascii="Arial" w:hAnsi="Arial" w:eastAsia="Hiragino Sans GB" w:cs="Arial"/>
+                <w:rFonts w:ascii="Arial" w:hAnsi="Arial" w:eastAsia="Hiragino Sans GB W3" w:cs="Arial"/>
                 <w:b w:val="0"/>
                 <w:color w:val="000000"/>
                 <w:sz w:val="19"/>
@@ -1943,7 +1943,7 @@
             </w:pPr>
             <w:r>
               <w:rPr>
-                <w:rFonts w:ascii="Arial" w:hAnsi="Arial" w:eastAsia="Hiragino Sans GB" w:cs="Arial"/>
+                <w:rFonts w:ascii="Arial" w:hAnsi="Arial" w:eastAsia="Hiragino Sans GB W3" w:cs="Arial"/>
                 <w:b w:val="0"/>
                 <w:color w:val="000000"/>
                 <w:sz w:val="19"/>
@@ -1970,7 +1970,7 @@
             </w:pPr>
             <w:r>
               <w:rPr>
-                <w:rFonts w:ascii="Arial" w:hAnsi="Arial" w:eastAsia="Hiragino Sans GB" w:cs="Arial"/>
+                <w:rFonts w:ascii="Arial" w:hAnsi="Arial" w:eastAsia="Hiragino Sans GB W3" w:cs="Arial"/>
                 <w:b w:val="0"/>
                 <w:color w:val="000000"/>
                 <w:sz w:val="19"/>
@@ -1986,7 +1986,7 @@
             </w:pPr>
             <w:r>
               <w:rPr>
-                <w:rFonts w:ascii="Arial" w:hAnsi="Arial" w:eastAsia="Hiragino Sans GB" w:cs="Arial"/>
+                <w:rFonts w:ascii="Arial" w:hAnsi="Arial" w:eastAsia="Hiragino Sans GB W3" w:cs="Arial"/>
                 <w:b w:val="0"/>
                 <w:color w:val="555555"/>
                 <w:sz w:val="17"/>
@@ -2002,7 +2002,7 @@
             </w:pPr>
             <w:r>
               <w:rPr>
-                <w:rFonts w:ascii="Arial" w:hAnsi="Arial" w:eastAsia="Hiragino Sans GB" w:cs="Arial"/>
+                <w:rFonts w:ascii="Arial" w:hAnsi="Arial" w:eastAsia="Hiragino Sans GB W3" w:cs="Arial"/>
                 <w:b w:val="0"/>
                 <w:color w:val="555555"/>
                 <w:sz w:val="17"/>
@@ -2024,7 +2024,7 @@
             </w:pPr>
             <w:r>
               <w:rPr>
-                <w:rFonts w:ascii="Arial" w:hAnsi="Arial" w:eastAsia="Hiragino Sans GB" w:cs="Arial"/>
+                <w:rFonts w:ascii="Arial" w:hAnsi="Arial" w:eastAsia="Hiragino Sans GB W3" w:cs="Arial"/>
                 <w:b w:val="0"/>
                 <w:color w:val="000000"/>
                 <w:sz w:val="19"/>
@@ -2046,7 +2046,7 @@
             </w:pPr>
             <w:r>
               <w:rPr>
-                <w:rFonts w:ascii="Arial" w:hAnsi="Arial" w:eastAsia="Hiragino Sans GB" w:cs="Arial"/>
+                <w:rFonts w:ascii="Arial" w:hAnsi="Arial" w:eastAsia="Hiragino Sans GB W3" w:cs="Arial"/>
                 <w:b w:val="0"/>
                 <w:color w:val="000000"/>
                 <w:sz w:val="19"/>
@@ -2067,7 +2067,7 @@
       </w:pPr>
       <w:r>
         <w:rPr>
-          <w:rFonts w:ascii="Arial" w:hAnsi="Arial" w:eastAsia="Hiragino Sans GB" w:cs="Arial"/>
+          <w:rFonts w:ascii="Arial" w:hAnsi="Arial" w:eastAsia="Hiragino Sans GB W3" w:cs="Arial"/>
           <w:b/>
           <w:color w:val="000000"/>
           <w:sz w:val="28"/>
@@ -2085,7 +2085,7 @@
       </w:pPr>
       <w:r>
         <w:rPr>
-          <w:rFonts w:ascii="Arial" w:hAnsi="Arial" w:eastAsia="Hiragino Sans GB" w:cs="Arial"/>
+          <w:rFonts w:ascii="Arial" w:hAnsi="Arial" w:eastAsia="Hiragino Sans GB W3" w:cs="Arial"/>
           <w:b/>
           <w:color w:val="000000"/>
           <w:sz w:val="24"/>
@@ -2101,7 +2101,7 @@
       </w:pPr>
       <w:r>
         <w:rPr>
-          <w:rFonts w:ascii="Arial" w:hAnsi="Arial" w:eastAsia="Hiragino Sans GB" w:cs="Arial"/>
+          <w:rFonts w:ascii="Arial" w:hAnsi="Arial" w:eastAsia="Hiragino Sans GB W3" w:cs="Arial"/>
           <w:b w:val="0"/>
           <w:color w:val="000000"/>
           <w:sz w:val="22"/>
@@ -2117,7 +2117,7 @@
       </w:pPr>
       <w:r>
         <w:rPr>
-          <w:rFonts w:ascii="Arial" w:hAnsi="Arial" w:eastAsia="Hiragino Sans GB" w:cs="Arial"/>
+          <w:rFonts w:ascii="Arial" w:hAnsi="Arial" w:eastAsia="Hiragino Sans GB W3" w:cs="Arial"/>
           <w:b w:val="0"/>
           <w:color w:val="000000"/>
           <w:sz w:val="22"/>
@@ -2133,7 +2133,7 @@
       </w:pPr>
       <w:r>
         <w:rPr>
-          <w:rFonts w:ascii="Arial" w:hAnsi="Arial" w:eastAsia="Hiragino Sans GB" w:cs="Arial"/>
+          <w:rFonts w:ascii="Arial" w:hAnsi="Arial" w:eastAsia="Hiragino Sans GB W3" w:cs="Arial"/>
           <w:b w:val="0"/>
           <w:color w:val="000000"/>
           <w:sz w:val="22"/>
@@ -2149,7 +2149,7 @@
       </w:pPr>
       <w:r>
         <w:rPr>
-          <w:rFonts w:ascii="Arial" w:hAnsi="Arial" w:eastAsia="Hiragino Sans GB" w:cs="Arial"/>
+          <w:rFonts w:ascii="Arial" w:hAnsi="Arial" w:eastAsia="Hiragino Sans GB W3" w:cs="Arial"/>
           <w:b w:val="0"/>
           <w:color w:val="000000"/>
           <w:sz w:val="22"/>
@@ -2165,7 +2165,7 @@
       </w:pPr>
       <w:r>
         <w:rPr>
-          <w:rFonts w:ascii="Arial" w:hAnsi="Arial" w:eastAsia="Hiragino Sans GB" w:cs="Arial"/>
+          <w:rFonts w:ascii="Arial" w:hAnsi="Arial" w:eastAsia="Hiragino Sans GB W3" w:cs="Arial"/>
           <w:b w:val="0"/>
           <w:color w:val="000000"/>
           <w:sz w:val="22"/>
@@ -2183,7 +2183,7 @@
       </w:pPr>
       <w:r>
         <w:rPr>
-          <w:rFonts w:ascii="Arial" w:hAnsi="Arial" w:eastAsia="Hiragino Sans GB" w:cs="Arial"/>
+          <w:rFonts w:ascii="Arial" w:hAnsi="Arial" w:eastAsia="Hiragino Sans GB W3" w:cs="Arial"/>
           <w:b/>
           <w:color w:val="000000"/>
           <w:sz w:val="24"/>
@@ -2199,7 +2199,7 @@
       </w:pPr>
       <w:r>
         <w:rPr>
-          <w:rFonts w:ascii="Arial" w:hAnsi="Arial" w:eastAsia="Hiragino Sans GB" w:cs="Arial"/>
+          <w:rFonts w:ascii="Arial" w:hAnsi="Arial" w:eastAsia="Hiragino Sans GB W3" w:cs="Arial"/>
           <w:b w:val="0"/>
           <w:color w:val="000000"/>
           <w:sz w:val="22"/>
@@ -2215,7 +2215,7 @@
       </w:pPr>
       <w:r>
         <w:rPr>
-          <w:rFonts w:ascii="Arial" w:hAnsi="Arial" w:eastAsia="Hiragino Sans GB" w:cs="Arial"/>
+          <w:rFonts w:ascii="Arial" w:hAnsi="Arial" w:eastAsia="Hiragino Sans GB W3" w:cs="Arial"/>
           <w:b w:val="0"/>
           <w:color w:val="000000"/>
           <w:sz w:val="22"/>
@@ -2244,7 +2244,7 @@
     </w:pPr>
     <w:r>
       <w:rPr>
-        <w:rFonts w:ascii="Arial" w:hAnsi="Arial" w:eastAsia="Hiragino Sans GB" w:cs="Arial"/>
+        <w:rFonts w:ascii="Arial" w:hAnsi="Arial" w:eastAsia="Hiragino Sans GB W3" w:cs="Arial"/>
         <w:b w:val="0"/>
         <w:color w:val="555555"/>
         <w:sz w:val="18"/>
@@ -2253,7 +2253,7 @@
     </w:r>
     <w:r>
       <w:rPr>
-        <w:rFonts w:ascii="Arial" w:hAnsi="Arial" w:eastAsia="Hiragino Sans GB" w:cs="Arial"/>
+        <w:rFonts w:ascii="Arial" w:hAnsi="Arial" w:eastAsia="Hiragino Sans GB W3" w:cs="Arial"/>
         <w:b w:val="0"/>
         <w:color w:val="555555"/>
         <w:sz w:val="18"/>
@@ -2264,7 +2264,7 @@
     </w:r>
     <w:r>
       <w:rPr>
-        <w:rFonts w:ascii="Arial" w:hAnsi="Arial" w:eastAsia="Hiragino Sans GB" w:cs="Arial"/>
+        <w:rFonts w:ascii="Arial" w:hAnsi="Arial" w:eastAsia="Hiragino Sans GB W3" w:cs="Arial"/>
         <w:b w:val="0"/>
         <w:color w:val="555555"/>
         <w:sz w:val="18"/>
@@ -2273,7 +2273,7 @@
     </w:r>
     <w:r>
       <w:rPr>
-        <w:rFonts w:ascii="Arial" w:hAnsi="Arial" w:eastAsia="Hiragino Sans GB" w:cs="Arial"/>
+        <w:rFonts w:ascii="Arial" w:hAnsi="Arial" w:eastAsia="Hiragino Sans GB W3" w:cs="Arial"/>
         <w:b w:val="0"/>
         <w:color w:val="555555"/>
         <w:sz w:val="18"/>
@@ -2284,7 +2284,7 @@
     </w:r>
     <w:r>
       <w:rPr>
-        <w:rFonts w:ascii="Arial" w:hAnsi="Arial" w:eastAsia="Hiragino Sans GB" w:cs="Arial"/>
+        <w:rFonts w:ascii="Arial" w:hAnsi="Arial" w:eastAsia="Hiragino Sans GB W3" w:cs="Arial"/>
         <w:b w:val="0"/>
         <w:color w:val="555555"/>
         <w:sz w:val="18"/>
@@ -2662,7 +2662,7 @@
       <w:spacing w:line="320" w:lineRule="exact" w:after="100"/>
     </w:pPr>
     <w:rPr>
-      <w:rFonts w:ascii="Arial" w:hAnsi="Arial" w:eastAsia="Hiragino Sans GB"/>
+      <w:rFonts w:ascii="Arial" w:hAnsi="Arial" w:eastAsia="Hiragino Sans GB W3"/>
       <w:sz w:val="22"/>
     </w:rPr>
   </w:style>
@@ -2725,7 +2725,7 @@
       <w:outlineLvl w:val="0"/>
     </w:pPr>
     <w:rPr>
-      <w:rFonts w:asciiTheme="majorHAnsi" w:eastAsiaTheme="majorEastAsia" w:hAnsiTheme="majorHAnsi" w:cstheme="majorBidi" w:ascii="Arial" w:hAnsi="Arial" w:eastAsia="Hiragino Sans GB"/>
+      <w:rFonts w:asciiTheme="majorHAnsi" w:eastAsiaTheme="majorEastAsia" w:hAnsiTheme="majorHAnsi" w:cstheme="majorBidi" w:ascii="Arial" w:hAnsi="Arial" w:eastAsia="Hiragino Sans GB W3"/>
       <w:b/>
       <w:bCs/>
       <w:color w:val="000000"/>
@@ -2749,7 +2749,7 @@
       <w:outlineLvl w:val="1"/>
     </w:pPr>
     <w:rPr>
-      <w:rFonts w:asciiTheme="majorHAnsi" w:eastAsiaTheme="majorEastAsia" w:hAnsiTheme="majorHAnsi" w:cstheme="majorBidi" w:ascii="Arial" w:hAnsi="Arial" w:eastAsia="Hiragino Sans GB"/>
+      <w:rFonts w:asciiTheme="majorHAnsi" w:eastAsiaTheme="majorEastAsia" w:hAnsiTheme="majorHAnsi" w:cstheme="majorBidi" w:ascii="Arial" w:hAnsi="Arial" w:eastAsia="Hiragino Sans GB W3"/>
       <w:b/>
       <w:bCs/>
       <w:color w:val="000000"/>
@@ -3011,7 +3011,7 @@
       <w:contextualSpacing/>
     </w:pPr>
     <w:rPr>
-      <w:rFonts w:asciiTheme="majorHAnsi" w:eastAsiaTheme="majorEastAsia" w:hAnsiTheme="majorHAnsi" w:cstheme="majorBidi" w:ascii="Arial" w:hAnsi="Arial" w:eastAsia="Hiragino Sans GB"/>
+      <w:rFonts w:asciiTheme="majorHAnsi" w:eastAsiaTheme="majorEastAsia" w:hAnsiTheme="majorHAnsi" w:cstheme="majorBidi" w:ascii="Arial" w:hAnsi="Arial" w:eastAsia="Hiragino Sans GB W3"/>
       <w:b/>
       <w:color w:val="000000"/>
       <w:spacing w:val="5"/>

</xml_diff>